<commit_message>
Agregar Fecha de cobro en sanciones. Agregar filtrado por Nombre, número de empleado y centro de costos para baja/alta masiva. Corregir al crear contrato. Añadir registros y modificaciones al generar contrato.
</commit_message>
<xml_diff>
--- a/rh/gestion_empleados/archivos/prueba.docx
+++ b/rh/gestion_empleados/archivos/prueba.docx
@@ -10877,7 +10877,7 @@
           <w:szCs w:val="10"/>
           <w:lang w:val="es-MX"/>
         </w:rPr>
-        <w:t xml:space="preserve">(SE AJUSTA DE </w:t>
+        <w:t xml:space="preserve">(SE AJUSTA </w:t>
       </w:r>
       <w:proofErr w:type="gramStart"/>
       <w:r>
@@ -10887,7 +10887,16 @@
           <w:szCs w:val="10"/>
           <w:lang w:val="es-MX"/>
         </w:rPr>
-        <w:t>ACUERDO  AL</w:t>
+        <w:t xml:space="preserve">DE </w:t>
+      </w:r>
+      <w:r>
+        <w:rPr>
+          <w:rFonts w:ascii="Arial" w:eastAsia="Arial" w:hAnsi="Arial" w:cs="Arial"/>
+          <w:sz w:val="10"/>
+          <w:szCs w:val="10"/>
+          <w:lang w:val="es-MX"/>
+        </w:rPr>
+        <w:t>ACUERDO AL</w:t>
       </w:r>
       <w:proofErr w:type="gramEnd"/>
       <w:r>
@@ -11883,7 +11892,25 @@
           <w:sz w:val="10"/>
           <w:szCs w:val="10"/>
         </w:rPr>
-        <w:t>X</w:t>
+        <w:t>{{</w:t>
+      </w:r>
+      <w:proofErr w:type="spellStart"/>
+      <w:r>
+        <w:rPr>
+          <w:rFonts w:ascii="Arial" w:eastAsia="Arial" w:hAnsi="Arial" w:cs="Arial"/>
+          <w:sz w:val="10"/>
+          <w:szCs w:val="10"/>
+        </w:rPr>
+        <w:t>AniosExperiencia</w:t>
+      </w:r>
+      <w:proofErr w:type="spellEnd"/>
+      <w:r>
+        <w:rPr>
+          <w:rFonts w:ascii="Arial" w:eastAsia="Arial" w:hAnsi="Arial" w:cs="Arial"/>
+          <w:sz w:val="10"/>
+          <w:szCs w:val="10"/>
+        </w:rPr>
+        <w:t>}}</w:t>
       </w:r>
       <w:r>
         <w:rPr>
@@ -18737,309 +18764,455 @@
       <w:r>
         <w:rPr>
           <w:rFonts w:ascii="Arial" w:eastAsia="Arial" w:hAnsi="Arial" w:cs="Arial"/>
+          <w:b/>
+          <w:bCs/>
           <w:spacing w:val="5"/>
           <w:sz w:val="10"/>
           <w:szCs w:val="10"/>
         </w:rPr>
+        <w:t>${{</w:t>
+      </w:r>
+      <w:proofErr w:type="spellStart"/>
+      <w:r>
+        <w:rPr>
+          <w:rFonts w:ascii="Arial" w:eastAsia="Arial" w:hAnsi="Arial" w:cs="Arial"/>
+          <w:b/>
+          <w:bCs/>
+          <w:spacing w:val="5"/>
+          <w:sz w:val="10"/>
+          <w:szCs w:val="10"/>
+        </w:rPr>
+        <w:t>ImporteBruto</w:t>
+      </w:r>
+      <w:proofErr w:type="spellEnd"/>
+      <w:r>
+        <w:rPr>
+          <w:rFonts w:ascii="Arial" w:eastAsia="Arial" w:hAnsi="Arial" w:cs="Arial"/>
+          <w:b/>
+          <w:bCs/>
+          <w:spacing w:val="5"/>
+          <w:sz w:val="10"/>
+          <w:szCs w:val="10"/>
+        </w:rPr>
+        <w:t>}}</w:t>
+      </w:r>
+      <w:r>
+        <w:rPr>
+          <w:rFonts w:ascii="Arial" w:eastAsia="Arial" w:hAnsi="Arial" w:cs="Arial"/>
+          <w:b/>
+          <w:sz w:val="10"/>
+          <w:szCs w:val="10"/>
+        </w:rPr>
+        <w:t>,</w:t>
+      </w:r>
+      <w:r>
+        <w:rPr>
+          <w:rFonts w:ascii="Arial" w:eastAsia="Arial" w:hAnsi="Arial" w:cs="Arial"/>
+          <w:b/>
+          <w:spacing w:val="3"/>
+          <w:sz w:val="10"/>
+          <w:szCs w:val="10"/>
+        </w:rPr>
+        <w:t xml:space="preserve"> </w:t>
+      </w:r>
+      <w:r>
+        <w:rPr>
+          <w:rFonts w:ascii="Arial" w:eastAsia="Arial" w:hAnsi="Arial" w:cs="Arial"/>
+          <w:b/>
+          <w:spacing w:val="1"/>
+          <w:sz w:val="10"/>
+          <w:szCs w:val="10"/>
+        </w:rPr>
+        <w:t>(</w:t>
+      </w:r>
+      <w:r>
+        <w:rPr>
+          <w:rFonts w:ascii="Arial" w:eastAsia="Arial" w:hAnsi="Arial" w:cs="Arial"/>
+          <w:b/>
+          <w:spacing w:val="1"/>
+          <w:sz w:val="10"/>
+          <w:szCs w:val="10"/>
+        </w:rPr>
+        <w:t>{{</w:t>
+      </w:r>
+      <w:proofErr w:type="spellStart"/>
+      <w:r>
+        <w:rPr>
+          <w:rFonts w:ascii="Arial" w:eastAsia="Arial" w:hAnsi="Arial" w:cs="Arial"/>
+          <w:b/>
+          <w:spacing w:val="1"/>
+          <w:sz w:val="10"/>
+          <w:szCs w:val="10"/>
+        </w:rPr>
+        <w:t>ImporteBrutoLetra</w:t>
+      </w:r>
+      <w:proofErr w:type="spellEnd"/>
+      <w:r>
+        <w:rPr>
+          <w:rFonts w:ascii="Arial" w:eastAsia="Arial" w:hAnsi="Arial" w:cs="Arial"/>
+          <w:b/>
+          <w:spacing w:val="1"/>
+          <w:sz w:val="10"/>
+          <w:szCs w:val="10"/>
+        </w:rPr>
+        <w:t>}}</w:t>
+      </w:r>
+      <w:r>
+        <w:rPr>
+          <w:rFonts w:ascii="Arial" w:eastAsia="Arial" w:hAnsi="Arial" w:cs="Arial"/>
+          <w:b/>
+          <w:sz w:val="10"/>
+          <w:szCs w:val="10"/>
+        </w:rPr>
+        <w:t>).</w:t>
+      </w:r>
+      <w:r>
+        <w:rPr>
+          <w:rFonts w:ascii="Arial" w:eastAsia="Arial" w:hAnsi="Arial" w:cs="Arial"/>
+          <w:b/>
+          <w:spacing w:val="1"/>
+          <w:sz w:val="10"/>
+          <w:szCs w:val="10"/>
+        </w:rPr>
+        <w:t xml:space="preserve"> </w:t>
+      </w:r>
+      <w:r>
+        <w:rPr>
+          <w:rFonts w:ascii="Arial" w:eastAsia="Arial" w:hAnsi="Arial" w:cs="Arial"/>
+          <w:sz w:val="10"/>
+          <w:szCs w:val="10"/>
+          <w:lang w:val="es-MX"/>
+        </w:rPr>
+        <w:t>DICHO</w:t>
+      </w:r>
+      <w:r>
+        <w:rPr>
+          <w:rFonts w:ascii="Arial" w:eastAsia="Arial" w:hAnsi="Arial" w:cs="Arial"/>
+          <w:spacing w:val="1"/>
+          <w:sz w:val="10"/>
+          <w:szCs w:val="10"/>
+          <w:lang w:val="es-MX"/>
+        </w:rPr>
+        <w:t xml:space="preserve"> </w:t>
+      </w:r>
+      <w:r>
+        <w:rPr>
+          <w:rFonts w:ascii="Arial" w:eastAsia="Arial" w:hAnsi="Arial" w:cs="Arial"/>
+          <w:sz w:val="10"/>
+          <w:szCs w:val="10"/>
+          <w:lang w:val="es-MX"/>
+        </w:rPr>
+        <w:t>IMPORTE</w:t>
+      </w:r>
+      <w:r>
+        <w:rPr>
+          <w:rFonts w:ascii="Arial" w:eastAsia="Arial" w:hAnsi="Arial" w:cs="Arial"/>
+          <w:spacing w:val="1"/>
+          <w:sz w:val="10"/>
+          <w:szCs w:val="10"/>
+          <w:lang w:val="es-MX"/>
+        </w:rPr>
+        <w:t xml:space="preserve"> </w:t>
+      </w:r>
+      <w:r>
+        <w:rPr>
+          <w:rFonts w:ascii="Arial" w:eastAsia="Arial" w:hAnsi="Arial" w:cs="Arial"/>
+          <w:sz w:val="10"/>
+          <w:szCs w:val="10"/>
+          <w:lang w:val="es-MX"/>
+        </w:rPr>
+        <w:t>SERÁ</w:t>
+      </w:r>
+      <w:r>
+        <w:rPr>
+          <w:rFonts w:ascii="Arial" w:eastAsia="Arial" w:hAnsi="Arial" w:cs="Arial"/>
+          <w:spacing w:val="1"/>
+          <w:sz w:val="10"/>
+          <w:szCs w:val="10"/>
+          <w:lang w:val="es-MX"/>
+        </w:rPr>
+        <w:t xml:space="preserve"> </w:t>
+      </w:r>
+      <w:r>
+        <w:rPr>
+          <w:rFonts w:ascii="Arial" w:eastAsia="Arial" w:hAnsi="Arial" w:cs="Arial"/>
+          <w:sz w:val="10"/>
+          <w:szCs w:val="10"/>
+          <w:lang w:val="es-MX"/>
+        </w:rPr>
+        <w:t>PAGADO</w:t>
+      </w:r>
+      <w:r>
+        <w:rPr>
+          <w:rFonts w:ascii="Arial" w:eastAsia="Arial" w:hAnsi="Arial" w:cs="Arial"/>
+          <w:spacing w:val="1"/>
+          <w:sz w:val="10"/>
+          <w:szCs w:val="10"/>
+          <w:lang w:val="es-MX"/>
+        </w:rPr>
+        <w:t xml:space="preserve"> </w:t>
+      </w:r>
+      <w:r>
+        <w:rPr>
+          <w:rFonts w:ascii="Arial" w:eastAsia="Arial" w:hAnsi="Arial" w:cs="Arial"/>
+          <w:sz w:val="10"/>
+          <w:szCs w:val="10"/>
+          <w:lang w:val="es-MX"/>
+        </w:rPr>
+        <w:t>EN</w:t>
+      </w:r>
+      <w:r>
+        <w:rPr>
+          <w:rFonts w:ascii="Arial" w:eastAsia="Arial" w:hAnsi="Arial" w:cs="Arial"/>
+          <w:spacing w:val="1"/>
+          <w:sz w:val="10"/>
+          <w:szCs w:val="10"/>
+          <w:lang w:val="es-MX"/>
+        </w:rPr>
+        <w:t xml:space="preserve"> </w:t>
+      </w:r>
+      <w:r>
+        <w:rPr>
+          <w:rFonts w:ascii="Arial" w:eastAsia="Arial" w:hAnsi="Arial" w:cs="Arial"/>
+          <w:b/>
+          <w:bCs/>
+          <w:sz w:val="10"/>
+          <w:szCs w:val="10"/>
+          <w:lang w:val="es-MX"/>
+        </w:rPr>
+        <w:t xml:space="preserve">(EJEMPLO: </w:t>
+      </w:r>
+      <w:r>
+        <w:rPr>
+          <w:rFonts w:ascii="Arial" w:eastAsia="Arial" w:hAnsi="Arial" w:cs="Arial"/>
+          <w:b/>
+          <w:bCs/>
+          <w:sz w:val="10"/>
+          <w:szCs w:val="10"/>
+          <w:lang w:val="es-MX"/>
+        </w:rPr>
+        <w:t>{{Exhibiciones}}</w:t>
+      </w:r>
+      <w:r>
+        <w:rPr>
+          <w:rFonts w:ascii="Arial" w:eastAsia="Arial" w:hAnsi="Arial" w:cs="Arial"/>
+          <w:b/>
+          <w:bCs/>
+          <w:sz w:val="10"/>
+          <w:szCs w:val="10"/>
+          <w:lang w:val="es-MX"/>
+        </w:rPr>
+        <w:t xml:space="preserve"> EXHIBICION(ES) MENSUAL</w:t>
+      </w:r>
+      <w:r>
+        <w:rPr>
+          <w:rFonts w:ascii="Arial" w:eastAsia="Arial" w:hAnsi="Arial" w:cs="Arial"/>
+          <w:b/>
+          <w:bCs/>
+          <w:sz w:val="10"/>
+          <w:szCs w:val="10"/>
+          <w:lang w:val="es-MX"/>
+        </w:rPr>
+        <w:t>(</w:t>
+      </w:r>
+      <w:r>
+        <w:rPr>
+          <w:rFonts w:ascii="Arial" w:eastAsia="Arial" w:hAnsi="Arial" w:cs="Arial"/>
+          <w:b/>
+          <w:bCs/>
+          <w:sz w:val="10"/>
+          <w:szCs w:val="10"/>
+          <w:lang w:val="es-MX"/>
+        </w:rPr>
+        <w:t>ES</w:t>
+      </w:r>
+      <w:r>
+        <w:rPr>
+          <w:rFonts w:ascii="Arial" w:eastAsia="Arial" w:hAnsi="Arial" w:cs="Arial"/>
+          <w:b/>
+          <w:bCs/>
+          <w:sz w:val="10"/>
+          <w:szCs w:val="10"/>
+          <w:lang w:val="es-MX"/>
+        </w:rPr>
+        <w:t>)</w:t>
+      </w:r>
+      <w:r>
+        <w:rPr>
+          <w:rFonts w:ascii="Arial" w:eastAsia="Arial" w:hAnsi="Arial" w:cs="Arial"/>
+          <w:b/>
+          <w:bCs/>
+          <w:sz w:val="10"/>
+          <w:szCs w:val="10"/>
+          <w:lang w:val="es-MX"/>
+        </w:rPr>
+        <w:t>)</w:t>
+      </w:r>
+      <w:r>
+        <w:rPr>
+          <w:rFonts w:ascii="Arial" w:eastAsia="Arial" w:hAnsi="Arial" w:cs="Arial"/>
+          <w:spacing w:val="1"/>
+          <w:sz w:val="10"/>
+          <w:szCs w:val="10"/>
+          <w:lang w:val="es-MX"/>
+        </w:rPr>
+        <w:t xml:space="preserve"> </w:t>
+      </w:r>
+      <w:r>
+        <w:rPr>
+          <w:rFonts w:ascii="Arial" w:eastAsia="Arial" w:hAnsi="Arial" w:cs="Arial"/>
+          <w:sz w:val="10"/>
+          <w:szCs w:val="10"/>
+          <w:lang w:val="es-MX"/>
+        </w:rPr>
+        <w:t>CON</w:t>
+      </w:r>
+      <w:r>
+        <w:rPr>
+          <w:rFonts w:ascii="Arial" w:eastAsia="Arial" w:hAnsi="Arial" w:cs="Arial"/>
+          <w:spacing w:val="1"/>
+          <w:sz w:val="10"/>
+          <w:szCs w:val="10"/>
+          <w:lang w:val="es-MX"/>
+        </w:rPr>
+        <w:t xml:space="preserve"> </w:t>
+      </w:r>
+      <w:r>
+        <w:rPr>
+          <w:rFonts w:ascii="Arial" w:eastAsia="Arial" w:hAnsi="Arial" w:cs="Arial"/>
+          <w:sz w:val="10"/>
+          <w:szCs w:val="10"/>
+          <w:lang w:val="es-MX"/>
+        </w:rPr>
+        <w:t>BASE</w:t>
+      </w:r>
+      <w:r>
+        <w:rPr>
+          <w:rFonts w:ascii="Arial" w:eastAsia="Arial" w:hAnsi="Arial" w:cs="Arial"/>
+          <w:spacing w:val="1"/>
+          <w:sz w:val="10"/>
+          <w:szCs w:val="10"/>
+          <w:lang w:val="es-MX"/>
+        </w:rPr>
+        <w:t xml:space="preserve"> </w:t>
+      </w:r>
+      <w:r>
+        <w:rPr>
+          <w:rFonts w:ascii="Arial" w:eastAsia="Arial" w:hAnsi="Arial" w:cs="Arial"/>
+          <w:sz w:val="10"/>
+          <w:szCs w:val="10"/>
+          <w:lang w:val="es-MX"/>
+        </w:rPr>
+        <w:t>A</w:t>
+      </w:r>
+      <w:r>
+        <w:rPr>
+          <w:rFonts w:ascii="Arial" w:eastAsia="Arial" w:hAnsi="Arial" w:cs="Arial"/>
+          <w:spacing w:val="1"/>
+          <w:sz w:val="10"/>
+          <w:szCs w:val="10"/>
+          <w:lang w:val="es-MX"/>
+        </w:rPr>
+        <w:t xml:space="preserve"> </w:t>
+      </w:r>
+      <w:r>
+        <w:rPr>
+          <w:rFonts w:ascii="Arial" w:eastAsia="Arial" w:hAnsi="Arial" w:cs="Arial"/>
+          <w:sz w:val="10"/>
+          <w:szCs w:val="10"/>
+          <w:lang w:val="es-MX"/>
+        </w:rPr>
+        <w:t>UN</w:t>
+      </w:r>
+      <w:r>
+        <w:rPr>
+          <w:rFonts w:ascii="Arial" w:eastAsia="Arial" w:hAnsi="Arial" w:cs="Arial"/>
+          <w:spacing w:val="1"/>
+          <w:sz w:val="10"/>
+          <w:szCs w:val="10"/>
+          <w:lang w:val="es-MX"/>
+        </w:rPr>
+        <w:t xml:space="preserve"> </w:t>
+      </w:r>
+      <w:r>
+        <w:rPr>
+          <w:rFonts w:ascii="Arial" w:eastAsia="Arial" w:hAnsi="Arial" w:cs="Arial"/>
+          <w:sz w:val="10"/>
+          <w:szCs w:val="10"/>
+          <w:lang w:val="es-MX"/>
+        </w:rPr>
+        <w:t>INGRESO MENSUAL</w:t>
+      </w:r>
+      <w:r>
+        <w:rPr>
+          <w:rFonts w:ascii="Arial" w:eastAsia="Arial" w:hAnsi="Arial" w:cs="Arial"/>
+          <w:spacing w:val="1"/>
+          <w:sz w:val="10"/>
+          <w:szCs w:val="10"/>
+          <w:lang w:val="es-MX"/>
+        </w:rPr>
+        <w:t xml:space="preserve"> </w:t>
+      </w:r>
+      <w:r>
+        <w:rPr>
+          <w:rFonts w:ascii="Arial" w:eastAsia="Arial" w:hAnsi="Arial" w:cs="Arial"/>
+          <w:sz w:val="10"/>
+          <w:szCs w:val="10"/>
+          <w:lang w:val="es-MX"/>
+        </w:rPr>
+        <w:t>DE</w:t>
+      </w:r>
+      <w:r>
+        <w:rPr>
+          <w:rFonts w:ascii="Arial" w:eastAsia="Arial" w:hAnsi="Arial" w:cs="Arial"/>
+          <w:spacing w:val="1"/>
+          <w:sz w:val="10"/>
+          <w:szCs w:val="10"/>
+          <w:lang w:val="es-MX"/>
+        </w:rPr>
+        <w:t xml:space="preserve"> </w:t>
+      </w:r>
+      <w:r>
+        <w:rPr>
+          <w:rFonts w:ascii="Arial" w:eastAsia="Arial" w:hAnsi="Arial" w:cs="Arial"/>
+          <w:b/>
+          <w:sz w:val="10"/>
+          <w:szCs w:val="10"/>
+          <w:lang w:val="es-MX"/>
+        </w:rPr>
         <w:t>$</w:t>
       </w:r>
       <w:r>
         <w:rPr>
           <w:rFonts w:ascii="Arial" w:eastAsia="Arial" w:hAnsi="Arial" w:cs="Arial"/>
           <w:b/>
-          <w:spacing w:val="1"/>
-          <w:sz w:val="10"/>
-          <w:szCs w:val="10"/>
-        </w:rPr>
-        <w:t>XXXX, XXX, XX</w:t>
-      </w:r>
-      <w:r>
-        <w:rPr>
-          <w:rFonts w:ascii="Arial" w:eastAsia="Arial" w:hAnsi="Arial" w:cs="Arial"/>
-          <w:b/>
-          <w:sz w:val="10"/>
-          <w:szCs w:val="10"/>
-        </w:rPr>
-        <w:t>,</w:t>
-      </w:r>
-      <w:r>
-        <w:rPr>
-          <w:rFonts w:ascii="Arial" w:eastAsia="Arial" w:hAnsi="Arial" w:cs="Arial"/>
-          <w:b/>
-          <w:spacing w:val="3"/>
-          <w:sz w:val="10"/>
-          <w:szCs w:val="10"/>
-        </w:rPr>
-        <w:t xml:space="preserve"> </w:t>
-      </w:r>
-      <w:r>
-        <w:rPr>
-          <w:rFonts w:ascii="Arial" w:eastAsia="Arial" w:hAnsi="Arial" w:cs="Arial"/>
-          <w:b/>
-          <w:spacing w:val="1"/>
-          <w:sz w:val="10"/>
-          <w:szCs w:val="10"/>
-        </w:rPr>
-        <w:t>(CANTIDAD DEL MONTO EN LETRA</w:t>
-      </w:r>
-      <w:r>
-        <w:rPr>
-          <w:rFonts w:ascii="Arial" w:eastAsia="Arial" w:hAnsi="Arial" w:cs="Arial"/>
-          <w:b/>
-          <w:sz w:val="10"/>
-          <w:szCs w:val="10"/>
-        </w:rPr>
-        <w:t>).</w:t>
-      </w:r>
-      <w:r>
-        <w:rPr>
-          <w:rFonts w:ascii="Arial" w:eastAsia="Arial" w:hAnsi="Arial" w:cs="Arial"/>
-          <w:b/>
-          <w:spacing w:val="1"/>
-          <w:sz w:val="10"/>
-          <w:szCs w:val="10"/>
-        </w:rPr>
-        <w:t xml:space="preserve"> </w:t>
-      </w:r>
-      <w:r>
-        <w:rPr>
-          <w:rFonts w:ascii="Arial" w:eastAsia="Arial" w:hAnsi="Arial" w:cs="Arial"/>
-          <w:sz w:val="10"/>
-          <w:szCs w:val="10"/>
-          <w:lang w:val="es-MX"/>
-        </w:rPr>
-        <w:t>DICHO</w:t>
-      </w:r>
-      <w:r>
-        <w:rPr>
-          <w:rFonts w:ascii="Arial" w:eastAsia="Arial" w:hAnsi="Arial" w:cs="Arial"/>
-          <w:spacing w:val="1"/>
-          <w:sz w:val="10"/>
-          <w:szCs w:val="10"/>
-          <w:lang w:val="es-MX"/>
-        </w:rPr>
-        <w:t xml:space="preserve"> </w:t>
-      </w:r>
-      <w:r>
-        <w:rPr>
-          <w:rFonts w:ascii="Arial" w:eastAsia="Arial" w:hAnsi="Arial" w:cs="Arial"/>
-          <w:sz w:val="10"/>
-          <w:szCs w:val="10"/>
-          <w:lang w:val="es-MX"/>
-        </w:rPr>
-        <w:t>IMPORTE</w:t>
-      </w:r>
-      <w:r>
-        <w:rPr>
-          <w:rFonts w:ascii="Arial" w:eastAsia="Arial" w:hAnsi="Arial" w:cs="Arial"/>
-          <w:spacing w:val="1"/>
-          <w:sz w:val="10"/>
-          <w:szCs w:val="10"/>
-          <w:lang w:val="es-MX"/>
-        </w:rPr>
-        <w:t xml:space="preserve"> </w:t>
-      </w:r>
-      <w:r>
-        <w:rPr>
-          <w:rFonts w:ascii="Arial" w:eastAsia="Arial" w:hAnsi="Arial" w:cs="Arial"/>
-          <w:sz w:val="10"/>
-          <w:szCs w:val="10"/>
-          <w:lang w:val="es-MX"/>
-        </w:rPr>
-        <w:t>SERÁ</w:t>
-      </w:r>
-      <w:r>
-        <w:rPr>
-          <w:rFonts w:ascii="Arial" w:eastAsia="Arial" w:hAnsi="Arial" w:cs="Arial"/>
-          <w:spacing w:val="1"/>
-          <w:sz w:val="10"/>
-          <w:szCs w:val="10"/>
-          <w:lang w:val="es-MX"/>
-        </w:rPr>
-        <w:t xml:space="preserve"> </w:t>
-      </w:r>
-      <w:r>
-        <w:rPr>
-          <w:rFonts w:ascii="Arial" w:eastAsia="Arial" w:hAnsi="Arial" w:cs="Arial"/>
-          <w:sz w:val="10"/>
-          <w:szCs w:val="10"/>
-          <w:lang w:val="es-MX"/>
-        </w:rPr>
-        <w:t>PAGADO</w:t>
-      </w:r>
-      <w:r>
-        <w:rPr>
-          <w:rFonts w:ascii="Arial" w:eastAsia="Arial" w:hAnsi="Arial" w:cs="Arial"/>
-          <w:spacing w:val="1"/>
-          <w:sz w:val="10"/>
-          <w:szCs w:val="10"/>
-          <w:lang w:val="es-MX"/>
-        </w:rPr>
-        <w:t xml:space="preserve"> </w:t>
-      </w:r>
-      <w:r>
-        <w:rPr>
-          <w:rFonts w:ascii="Arial" w:eastAsia="Arial" w:hAnsi="Arial" w:cs="Arial"/>
-          <w:sz w:val="10"/>
-          <w:szCs w:val="10"/>
-          <w:lang w:val="es-MX"/>
-        </w:rPr>
-        <w:t>EN</w:t>
-      </w:r>
-      <w:r>
-        <w:rPr>
-          <w:rFonts w:ascii="Arial" w:eastAsia="Arial" w:hAnsi="Arial" w:cs="Arial"/>
-          <w:spacing w:val="1"/>
-          <w:sz w:val="10"/>
-          <w:szCs w:val="10"/>
-          <w:lang w:val="es-MX"/>
-        </w:rPr>
-        <w:t xml:space="preserve"> </w:t>
-      </w:r>
-      <w:r>
-        <w:rPr>
-          <w:rFonts w:ascii="Arial" w:eastAsia="Arial" w:hAnsi="Arial" w:cs="Arial"/>
-          <w:b/>
-          <w:bCs/>
-          <w:sz w:val="10"/>
-          <w:szCs w:val="10"/>
-          <w:lang w:val="es-MX"/>
-        </w:rPr>
-        <w:t>(EJEMPLO: TRES EXHIBICION(ES) MENSUALES)</w:t>
-      </w:r>
-      <w:r>
-        <w:rPr>
-          <w:rFonts w:ascii="Arial" w:eastAsia="Arial" w:hAnsi="Arial" w:cs="Arial"/>
-          <w:spacing w:val="1"/>
-          <w:sz w:val="10"/>
-          <w:szCs w:val="10"/>
-          <w:lang w:val="es-MX"/>
-        </w:rPr>
-        <w:t xml:space="preserve"> </w:t>
-      </w:r>
-      <w:r>
-        <w:rPr>
-          <w:rFonts w:ascii="Arial" w:eastAsia="Arial" w:hAnsi="Arial" w:cs="Arial"/>
-          <w:sz w:val="10"/>
-          <w:szCs w:val="10"/>
-          <w:lang w:val="es-MX"/>
-        </w:rPr>
-        <w:t>CON</w:t>
-      </w:r>
-      <w:r>
-        <w:rPr>
-          <w:rFonts w:ascii="Arial" w:eastAsia="Arial" w:hAnsi="Arial" w:cs="Arial"/>
-          <w:spacing w:val="1"/>
-          <w:sz w:val="10"/>
-          <w:szCs w:val="10"/>
-          <w:lang w:val="es-MX"/>
-        </w:rPr>
-        <w:t xml:space="preserve"> </w:t>
-      </w:r>
-      <w:r>
-        <w:rPr>
-          <w:rFonts w:ascii="Arial" w:eastAsia="Arial" w:hAnsi="Arial" w:cs="Arial"/>
-          <w:sz w:val="10"/>
-          <w:szCs w:val="10"/>
-          <w:lang w:val="es-MX"/>
-        </w:rPr>
-        <w:t>BASE</w:t>
-      </w:r>
-      <w:r>
-        <w:rPr>
-          <w:rFonts w:ascii="Arial" w:eastAsia="Arial" w:hAnsi="Arial" w:cs="Arial"/>
-          <w:spacing w:val="1"/>
-          <w:sz w:val="10"/>
-          <w:szCs w:val="10"/>
-          <w:lang w:val="es-MX"/>
-        </w:rPr>
-        <w:t xml:space="preserve"> </w:t>
-      </w:r>
-      <w:r>
-        <w:rPr>
-          <w:rFonts w:ascii="Arial" w:eastAsia="Arial" w:hAnsi="Arial" w:cs="Arial"/>
-          <w:sz w:val="10"/>
-          <w:szCs w:val="10"/>
-          <w:lang w:val="es-MX"/>
-        </w:rPr>
-        <w:t>A</w:t>
-      </w:r>
-      <w:r>
-        <w:rPr>
-          <w:rFonts w:ascii="Arial" w:eastAsia="Arial" w:hAnsi="Arial" w:cs="Arial"/>
-          <w:spacing w:val="1"/>
-          <w:sz w:val="10"/>
-          <w:szCs w:val="10"/>
-          <w:lang w:val="es-MX"/>
-        </w:rPr>
-        <w:t xml:space="preserve"> </w:t>
-      </w:r>
-      <w:r>
-        <w:rPr>
-          <w:rFonts w:ascii="Arial" w:eastAsia="Arial" w:hAnsi="Arial" w:cs="Arial"/>
-          <w:sz w:val="10"/>
-          <w:szCs w:val="10"/>
-          <w:lang w:val="es-MX"/>
-        </w:rPr>
-        <w:t>UN</w:t>
-      </w:r>
-      <w:r>
-        <w:rPr>
-          <w:rFonts w:ascii="Arial" w:eastAsia="Arial" w:hAnsi="Arial" w:cs="Arial"/>
-          <w:spacing w:val="1"/>
-          <w:sz w:val="10"/>
-          <w:szCs w:val="10"/>
-          <w:lang w:val="es-MX"/>
-        </w:rPr>
-        <w:t xml:space="preserve"> </w:t>
-      </w:r>
-      <w:r>
-        <w:rPr>
-          <w:rFonts w:ascii="Arial" w:eastAsia="Arial" w:hAnsi="Arial" w:cs="Arial"/>
-          <w:sz w:val="10"/>
-          <w:szCs w:val="10"/>
-          <w:lang w:val="es-MX"/>
-        </w:rPr>
-        <w:t>INGRESO MENSUAL</w:t>
-      </w:r>
-      <w:r>
-        <w:rPr>
-          <w:rFonts w:ascii="Arial" w:eastAsia="Arial" w:hAnsi="Arial" w:cs="Arial"/>
-          <w:spacing w:val="1"/>
-          <w:sz w:val="10"/>
-          <w:szCs w:val="10"/>
-          <w:lang w:val="es-MX"/>
-        </w:rPr>
-        <w:t xml:space="preserve"> </w:t>
-      </w:r>
-      <w:r>
-        <w:rPr>
-          <w:rFonts w:ascii="Arial" w:eastAsia="Arial" w:hAnsi="Arial" w:cs="Arial"/>
-          <w:sz w:val="10"/>
-          <w:szCs w:val="10"/>
-          <w:lang w:val="es-MX"/>
-        </w:rPr>
-        <w:t>DE</w:t>
-      </w:r>
-      <w:r>
-        <w:rPr>
-          <w:rFonts w:ascii="Arial" w:eastAsia="Arial" w:hAnsi="Arial" w:cs="Arial"/>
-          <w:spacing w:val="1"/>
-          <w:sz w:val="10"/>
-          <w:szCs w:val="10"/>
-          <w:lang w:val="es-MX"/>
-        </w:rPr>
-        <w:t xml:space="preserve"> </w:t>
-      </w:r>
-      <w:r>
-        <w:rPr>
-          <w:rFonts w:ascii="Arial" w:eastAsia="Arial" w:hAnsi="Arial" w:cs="Arial"/>
-          <w:b/>
-          <w:sz w:val="10"/>
-          <w:szCs w:val="10"/>
-          <w:lang w:val="es-MX"/>
-        </w:rPr>
-        <w:t>$XX, XXX, XX</w:t>
+          <w:sz w:val="10"/>
+          <w:szCs w:val="10"/>
+          <w:lang w:val="es-MX"/>
+        </w:rPr>
+        <w:t>{{</w:t>
+      </w:r>
+      <w:proofErr w:type="spellStart"/>
+      <w:r>
+        <w:rPr>
+          <w:rFonts w:ascii="Arial" w:eastAsia="Arial" w:hAnsi="Arial" w:cs="Arial"/>
+          <w:b/>
+          <w:sz w:val="10"/>
+          <w:szCs w:val="10"/>
+          <w:lang w:val="es-MX"/>
+        </w:rPr>
+        <w:t>MontoPactado</w:t>
+      </w:r>
+      <w:proofErr w:type="spellEnd"/>
+      <w:r>
+        <w:rPr>
+          <w:rFonts w:ascii="Arial" w:eastAsia="Arial" w:hAnsi="Arial" w:cs="Arial"/>
+          <w:b/>
+          <w:sz w:val="10"/>
+          <w:szCs w:val="10"/>
+          <w:lang w:val="es-MX"/>
+        </w:rPr>
+        <w:t>}}</w:t>
       </w:r>
       <w:r>
         <w:rPr>
@@ -19708,7 +19881,7 @@
     </w:p>
     <w:p>
       <w:pPr>
-        <w:ind w:left="100" w:right="2162"/>
+        <w:ind w:left="100" w:right="36"/>
         <w:jc w:val="both"/>
         <w:rPr>
           <w:rFonts w:ascii="Arial" w:eastAsia="Arial" w:hAnsi="Arial" w:cs="Arial"/>
@@ -19750,7 +19923,112 @@
           <w:sz w:val="10"/>
           <w:szCs w:val="10"/>
         </w:rPr>
-        <w:t xml:space="preserve">XX DE XXXXX DE XXXXX </w:t>
+        <w:t>{{</w:t>
+      </w:r>
+      <w:proofErr w:type="spellStart"/>
+      <w:r>
+        <w:rPr>
+          <w:rFonts w:ascii="Arial" w:eastAsia="Arial" w:hAnsi="Arial" w:cs="Arial"/>
+          <w:b/>
+          <w:sz w:val="10"/>
+          <w:szCs w:val="10"/>
+        </w:rPr>
+        <w:t>DiaInicio</w:t>
+      </w:r>
+      <w:proofErr w:type="spellEnd"/>
+      <w:r>
+        <w:rPr>
+          <w:rFonts w:ascii="Arial" w:eastAsia="Arial" w:hAnsi="Arial" w:cs="Arial"/>
+          <w:b/>
+          <w:sz w:val="10"/>
+          <w:szCs w:val="10"/>
+        </w:rPr>
+        <w:t>}}</w:t>
+      </w:r>
+      <w:r>
+        <w:rPr>
+          <w:rFonts w:ascii="Arial" w:eastAsia="Arial" w:hAnsi="Arial" w:cs="Arial"/>
+          <w:b/>
+          <w:sz w:val="10"/>
+          <w:szCs w:val="10"/>
+        </w:rPr>
+        <w:t xml:space="preserve"> DE </w:t>
+      </w:r>
+      <w:r>
+        <w:rPr>
+          <w:rFonts w:ascii="Arial" w:eastAsia="Arial" w:hAnsi="Arial" w:cs="Arial"/>
+          <w:b/>
+          <w:sz w:val="10"/>
+          <w:szCs w:val="10"/>
+        </w:rPr>
+        <w:t>{{</w:t>
+      </w:r>
+      <w:proofErr w:type="spellStart"/>
+      <w:r>
+        <w:rPr>
+          <w:rFonts w:ascii="Arial" w:eastAsia="Arial" w:hAnsi="Arial" w:cs="Arial"/>
+          <w:b/>
+          <w:sz w:val="10"/>
+          <w:szCs w:val="10"/>
+        </w:rPr>
+        <w:t>MesInicio</w:t>
+      </w:r>
+      <w:proofErr w:type="spellEnd"/>
+      <w:r>
+        <w:rPr>
+          <w:rFonts w:ascii="Arial" w:eastAsia="Arial" w:hAnsi="Arial" w:cs="Arial"/>
+          <w:b/>
+          <w:sz w:val="10"/>
+          <w:szCs w:val="10"/>
+        </w:rPr>
+        <w:t>}}</w:t>
+      </w:r>
+      <w:r>
+        <w:rPr>
+          <w:rFonts w:ascii="Arial" w:eastAsia="Arial" w:hAnsi="Arial" w:cs="Arial"/>
+          <w:b/>
+          <w:sz w:val="10"/>
+          <w:szCs w:val="10"/>
+        </w:rPr>
+        <w:t xml:space="preserve"> DE </w:t>
+      </w:r>
+      <w:r>
+        <w:rPr>
+          <w:rFonts w:ascii="Arial" w:eastAsia="Arial" w:hAnsi="Arial" w:cs="Arial"/>
+          <w:b/>
+          <w:sz w:val="10"/>
+          <w:szCs w:val="10"/>
+        </w:rPr>
+        <w:t>{{</w:t>
+      </w:r>
+      <w:proofErr w:type="spellStart"/>
+      <w:r>
+        <w:rPr>
+          <w:rFonts w:ascii="Arial" w:eastAsia="Arial" w:hAnsi="Arial" w:cs="Arial"/>
+          <w:b/>
+          <w:sz w:val="10"/>
+          <w:szCs w:val="10"/>
+        </w:rPr>
+        <w:t>AnioInicio</w:t>
+      </w:r>
+      <w:proofErr w:type="spellEnd"/>
+      <w:r>
+        <w:rPr>
+          <w:rFonts w:ascii="Arial" w:eastAsia="Arial" w:hAnsi="Arial" w:cs="Arial"/>
+          <w:b/>
+          <w:sz w:val="10"/>
+          <w:szCs w:val="10"/>
+        </w:rPr>
+        <w:t>}}</w:t>
+      </w:r>
+      <w:r>
+        <w:rPr>
+          <w:rFonts w:ascii="Arial" w:eastAsia="Arial" w:hAnsi="Arial" w:cs="Arial"/>
+          <w:b/>
+          <w:sz w:val="10"/>
+          <w:szCs w:val="10"/>
+        </w:rPr>
+        <w:t xml:space="preserve"> </w:t>
       </w:r>
       <w:r>
         <w:rPr>
@@ -19767,7 +20045,130 @@
           <w:sz w:val="10"/>
           <w:szCs w:val="10"/>
         </w:rPr>
-        <w:t>XX DE XXXX DE XXXX. (SE A JUSTA A LA VIGENCIA SEGUN CORRESPONDA)</w:t>
+        <w:t>{{</w:t>
+      </w:r>
+      <w:proofErr w:type="spellStart"/>
+      <w:r>
+        <w:rPr>
+          <w:rFonts w:ascii="Arial" w:eastAsia="Arial" w:hAnsi="Arial" w:cs="Arial"/>
+          <w:b/>
+          <w:sz w:val="10"/>
+          <w:szCs w:val="10"/>
+        </w:rPr>
+        <w:t>DiaFin</w:t>
+      </w:r>
+      <w:proofErr w:type="spellEnd"/>
+      <w:r>
+        <w:rPr>
+          <w:rFonts w:ascii="Arial" w:eastAsia="Arial" w:hAnsi="Arial" w:cs="Arial"/>
+          <w:b/>
+          <w:sz w:val="10"/>
+          <w:szCs w:val="10"/>
+        </w:rPr>
+        <w:t>}}</w:t>
+      </w:r>
+      <w:r>
+        <w:rPr>
+          <w:rFonts w:ascii="Arial" w:eastAsia="Arial" w:hAnsi="Arial" w:cs="Arial"/>
+          <w:b/>
+          <w:sz w:val="10"/>
+          <w:szCs w:val="10"/>
+        </w:rPr>
+        <w:t xml:space="preserve"> DE </w:t>
+      </w:r>
+      <w:r>
+        <w:rPr>
+          <w:rFonts w:ascii="Arial" w:eastAsia="Arial" w:hAnsi="Arial" w:cs="Arial"/>
+          <w:b/>
+          <w:sz w:val="10"/>
+          <w:szCs w:val="10"/>
+        </w:rPr>
+        <w:t>{{</w:t>
+      </w:r>
+      <w:proofErr w:type="spellStart"/>
+      <w:r>
+        <w:rPr>
+          <w:rFonts w:ascii="Arial" w:eastAsia="Arial" w:hAnsi="Arial" w:cs="Arial"/>
+          <w:b/>
+          <w:sz w:val="10"/>
+          <w:szCs w:val="10"/>
+        </w:rPr>
+        <w:t>MesFin</w:t>
+      </w:r>
+      <w:proofErr w:type="spellEnd"/>
+      <w:r>
+        <w:rPr>
+          <w:rFonts w:ascii="Arial" w:eastAsia="Arial" w:hAnsi="Arial" w:cs="Arial"/>
+          <w:b/>
+          <w:sz w:val="10"/>
+          <w:szCs w:val="10"/>
+        </w:rPr>
+        <w:t>}}</w:t>
+      </w:r>
+      <w:r>
+        <w:rPr>
+          <w:rFonts w:ascii="Arial" w:eastAsia="Arial" w:hAnsi="Arial" w:cs="Arial"/>
+          <w:b/>
+          <w:sz w:val="10"/>
+          <w:szCs w:val="10"/>
+        </w:rPr>
+        <w:t xml:space="preserve"> DE </w:t>
+      </w:r>
+      <w:r>
+        <w:rPr>
+          <w:rFonts w:ascii="Arial" w:eastAsia="Arial" w:hAnsi="Arial" w:cs="Arial"/>
+          <w:b/>
+          <w:sz w:val="10"/>
+          <w:szCs w:val="10"/>
+        </w:rPr>
+        <w:t>{{</w:t>
+      </w:r>
+      <w:proofErr w:type="spellStart"/>
+      <w:r>
+        <w:rPr>
+          <w:rFonts w:ascii="Arial" w:eastAsia="Arial" w:hAnsi="Arial" w:cs="Arial"/>
+          <w:b/>
+          <w:sz w:val="10"/>
+          <w:szCs w:val="10"/>
+        </w:rPr>
+        <w:t>AnioFin</w:t>
+      </w:r>
+      <w:proofErr w:type="spellEnd"/>
+      <w:r>
+        <w:rPr>
+          <w:rFonts w:ascii="Arial" w:eastAsia="Arial" w:hAnsi="Arial" w:cs="Arial"/>
+          <w:b/>
+          <w:sz w:val="10"/>
+          <w:szCs w:val="10"/>
+        </w:rPr>
+        <w:t>}}</w:t>
+      </w:r>
+      <w:r>
+        <w:rPr>
+          <w:rFonts w:ascii="Arial" w:eastAsia="Arial" w:hAnsi="Arial" w:cs="Arial"/>
+          <w:b/>
+          <w:sz w:val="10"/>
+          <w:szCs w:val="10"/>
+        </w:rPr>
+        <w:t>. (SE A JUSTA A LA VIGENCIA</w:t>
+      </w:r>
+      <w:r>
+        <w:rPr>
+          <w:rFonts w:ascii="Arial" w:eastAsia="Arial" w:hAnsi="Arial" w:cs="Arial"/>
+          <w:b/>
+          <w:sz w:val="10"/>
+          <w:szCs w:val="10"/>
+        </w:rPr>
+        <w:t xml:space="preserve"> </w:t>
+      </w:r>
+      <w:r>
+        <w:rPr>
+          <w:rFonts w:ascii="Arial" w:eastAsia="Arial" w:hAnsi="Arial" w:cs="Arial"/>
+          <w:b/>
+          <w:sz w:val="10"/>
+          <w:szCs w:val="10"/>
+        </w:rPr>
+        <w:t>SEGUN CORRESPONDA)</w:t>
       </w:r>
     </w:p>
     <w:p>
@@ -24047,6 +24448,7 @@
           <w:szCs w:val="10"/>
           <w:lang w:val="es-MX"/>
         </w:rPr>
+        <w:lastRenderedPageBreak/>
         <w:t>PAR</w:t>
       </w:r>
       <w:r>
@@ -25476,37 +25878,21 @@
           <w:szCs w:val="10"/>
           <w:lang w:val="es-MX"/>
         </w:rPr>
-        <w:t>CORRESPONDIENTES.</w:t>
+        <w:t>CORRESPONDIENTES</w:t>
+      </w:r>
+      <w:r>
+        <w:rPr>
+          <w:rFonts w:ascii="Arial" w:eastAsia="Arial" w:hAnsi="Arial" w:cs="Arial"/>
+          <w:spacing w:val="1"/>
+          <w:sz w:val="10"/>
+          <w:szCs w:val="10"/>
+          <w:lang w:val="es-MX"/>
+        </w:rPr>
+        <w:t>.</w:t>
       </w:r>
     </w:p>
-    <w:p>
-      <w:pPr>
-        <w:spacing w:before="79" w:line="242" w:lineRule="auto"/>
-        <w:ind w:left="100" w:right="102"/>
-        <w:jc w:val="both"/>
-        <w:rPr>
-          <w:rFonts w:ascii="Arial" w:eastAsia="Arial" w:hAnsi="Arial" w:cs="Arial"/>
-          <w:spacing w:val="1"/>
-          <w:sz w:val="10"/>
-          <w:szCs w:val="10"/>
-          <w:lang w:val="es-MX"/>
-        </w:rPr>
-      </w:pPr>
-    </w:p>
-    <w:p>
-      <w:pPr>
-        <w:spacing w:before="79" w:line="242" w:lineRule="auto"/>
-        <w:ind w:left="100" w:right="102"/>
-        <w:jc w:val="both"/>
-        <w:rPr>
-          <w:rFonts w:ascii="Arial" w:eastAsia="Arial" w:hAnsi="Arial" w:cs="Arial"/>
-          <w:spacing w:val="1"/>
-          <w:sz w:val="10"/>
-          <w:szCs w:val="10"/>
-          <w:lang w:val="es-MX"/>
-        </w:rPr>
-      </w:pPr>
-    </w:p>
+    <w:bookmarkEnd w:id="0"/>
+    <w:bookmarkEnd w:id="1"/>
     <w:p>
       <w:pPr>
         <w:spacing w:before="79" w:line="242" w:lineRule="auto"/>
@@ -31349,17 +31735,7 @@
           <w:highlight w:val="yellow"/>
           <w:lang w:val="es-MX"/>
         </w:rPr>
-        <w:t xml:space="preserve"> DE 202</w:t>
-      </w:r>
-      <w:r>
-        <w:rPr>
-          <w:rFonts w:ascii="Arial" w:eastAsia="Arial" w:hAnsi="Arial" w:cs="Arial"/>
-          <w:sz w:val="10"/>
-          <w:szCs w:val="10"/>
-          <w:highlight w:val="yellow"/>
-          <w:lang w:val="es-MX"/>
-        </w:rPr>
-        <w:t>3</w:t>
+        <w:t xml:space="preserve"> DE 2023</w:t>
       </w:r>
       <w:r>
         <w:rPr>
@@ -35525,18 +35901,7 @@
           <w:szCs w:val="10"/>
           <w:lang w:val="es-MX"/>
         </w:rPr>
-        <w:t>MÉXICO</w:t>
-      </w:r>
-      <w:r>
-        <w:rPr>
-          <w:rFonts w:ascii="Arial" w:eastAsia="Arial" w:hAnsi="Arial" w:cs="Arial"/>
-          <w:b/>
-          <w:spacing w:val="1"/>
-          <w:sz w:val="10"/>
-          <w:szCs w:val="10"/>
-          <w:lang w:val="es-MX"/>
-        </w:rPr>
-        <w:t>,</w:t>
+        <w:t>MÉXICO,</w:t>
       </w:r>
       <w:r>
         <w:rPr>
@@ -35891,6 +36256,7 @@
           <w:lang w:val="es-MX"/>
         </w:rPr>
         <w:sectPr>
+          <w:type w:val="continuous"/>
           <w:pgSz w:w="12240" w:h="15840"/>
           <w:pgMar w:top="320" w:right="280" w:bottom="280" w:left="300" w:header="720" w:footer="720" w:gutter="0"/>
           <w:cols w:space="720"/>
@@ -36420,7 +36786,6 @@
         <w:tab/>
       </w:r>
     </w:p>
-    <w:bookmarkEnd w:id="0"/>
     <w:p>
       <w:pPr>
         <w:rPr>
@@ -36428,7 +36793,6 @@
         </w:rPr>
       </w:pPr>
     </w:p>
-    <w:bookmarkEnd w:id="1"/>
     <w:p>
       <w:pPr>
         <w:rPr>

</xml_diff>